<commit_message>
Remove special-measure (44h) establishment content from guide
Co-Authored-By: Claude Sonnet 5.5 <noreply@anthropic.com>
Claude-Session: https://claude.ai/code/session_01QFAYx3hUgCu68Gp44nxs92
</commit_message>
<xml_diff>
--- a/1か月単位の変形労働時間制.docx
+++ b/1か月単位の変形労働時間制.docx
@@ -55,7 +55,7 @@
         <w:rPr>
           <w:rFonts w:ascii="Yu Gothic" w:eastAsia="Yu Gothic" w:hAnsi="Yu Gothic"/>
         </w:rPr>
-        <w:t xml:space="preserve">１か月単位の変形労働時間制とは、１か月以内の期間を平均して、１週間当たりの労働時間が40時間（特例措置対象事業場は44時間）以内となるように、労働日および労働日ごとの労働時間をあらかじめ設定することで、特定の日に８時間、特定の週に40時間（特例措置対象事業場は44時間）を超えて労働させることを可能にする制度です。</w:t>
+        <w:t xml:space="preserve">１か月単位の変形労働時間制とは、１か月以内の期間を平均して、１週間当たりの労働時間が40時間以内となるように、労働日および労働日ごとの労働時間をあらかじめ設定することで、特定の日に８時間、特定の週に40時間を超えて労働させることを可能にする制度です。</w:t>
       </w:r>
     </w:p>
     <w:p>
@@ -69,70 +69,6 @@
         <w:t xml:space="preserve">月初や月末に業務が集中する業種、シフト勤務の業種（医療・介護、運輸、小売、サービス業など）で広く活用されています。</w:t>
       </w:r>
     </w:p>
-    <w:tbl>
-      <w:tblPr>
-        <w:tblW w:type="dxa" w:w="9638"/>
-        <w:tblBorders>
-          <w:top w:val="single" w:color="auto" w:sz="4"/>
-          <w:left w:val="single" w:color="auto" w:sz="4"/>
-          <w:bottom w:val="single" w:color="auto" w:sz="4"/>
-          <w:right w:val="single" w:color="auto" w:sz="4"/>
-          <w:insideH w:val="single" w:color="auto" w:sz="4"/>
-          <w:insideV w:val="single" w:color="auto" w:sz="4"/>
-        </w:tblBorders>
-        <w:tblLayout w:type="fixed"/>
-      </w:tblPr>
-      <w:tblGrid>
-        <w:gridCol w:w="9638"/>
-      </w:tblGrid>
-      <w:tr>
-        <w:tc>
-          <w:tcPr>
-            <w:tcW w:type="dxa" w:w="9638"/>
-            <w:tcBorders>
-              <w:top w:val="single" w:color="A6B4C5" w:sz="4"/>
-              <w:left w:val="single" w:color="1F3A5F" w:sz="24"/>
-              <w:bottom w:val="single" w:color="A6B4C5" w:sz="4"/>
-              <w:right w:val="single" w:color="A6B4C5" w:sz="4"/>
-            </w:tcBorders>
-            <w:shd w:fill="F4F7FA" w:color="auto" w:val="clear"/>
-            <w:tcMar>
-              <w:top w:type="dxa" w:w="120"/>
-              <w:left w:type="dxa" w:w="200"/>
-              <w:bottom w:type="dxa" w:w="120"/>
-              <w:right w:type="dxa" w:w="160"/>
-            </w:tcMar>
-          </w:tcPr>
-          <w:p>
-            <w:pPr>
-              <w:spacing w:after="60"/>
-            </w:pPr>
-            <w:r>
-              <w:rPr>
-                <w:rFonts w:ascii="Yu Gothic" w:eastAsia="Yu Gothic" w:hAnsi="Yu Gothic"/>
-                <w:b/>
-                <w:bCs/>
-                <w:color w:val="1F3A5F"/>
-              </w:rPr>
-              <w:t xml:space="preserve">特例措置対象事業場とは</w:t>
-            </w:r>
-          </w:p>
-          <w:p>
-            <w:pPr>
-              <w:spacing w:after="40" w:line="300"/>
-            </w:pPr>
-            <w:r>
-              <w:rPr>
-                <w:rFonts w:ascii="Yu Gothic" w:eastAsia="Yu Gothic" w:hAnsi="Yu Gothic"/>
-                <w:sz w:val="21"/>
-                <w:szCs w:val="21"/>
-              </w:rPr>
-              <w:t xml:space="preserve">常時使用する労働者数が10人未満の、商業、映画・演劇業（映画の製作の事業を除く）、保健衛生業、接客娯楽業の事業場で、週の法定労働時間が44時間となります。</w:t>
-            </w:r>
-          </w:p>
-        </w:tc>
-      </w:tr>
-    </w:tbl>
     <w:p>
       <w:pPr>
         <w:spacing w:after="120"/>
@@ -172,7 +108,7 @@
           <w:bCs/>
           <w:color w:val="1F3A5F"/>
         </w:rPr>
-        <w:t xml:space="preserve">上限時間 ＝ 週の法定労働時間（40時間／44時間）× 対象期間の暦日数 ÷ ７</w:t>
+        <w:t xml:space="preserve">上限時間 ＝ 週の法定労働時間（40時間）× 対象期間の暦日数 ÷ ７</w:t>
       </w:r>
     </w:p>
     <w:p>
@@ -568,182 +504,6 @@
           </w:p>
         </w:tc>
       </w:tr>
-      <w:tr>
-        <w:trPr>
-          <w:cantSplit/>
-        </w:trPr>
-        <w:tc>
-          <w:tcPr>
-            <w:tcW w:type="dxa" w:w="2638"/>
-            <w:tcBorders>
-              <w:top w:val="single" w:color="A6B4C5" w:sz="4"/>
-              <w:left w:val="single" w:color="A6B4C5" w:sz="4"/>
-              <w:bottom w:val="single" w:color="A6B4C5" w:sz="4"/>
-              <w:right w:val="single" w:color="A6B4C5" w:sz="4"/>
-            </w:tcBorders>
-            <w:shd w:fill="E8EEF5" w:color="auto" w:val="clear"/>
-            <w:tcMar>
-              <w:top w:type="dxa" w:w="80"/>
-              <w:left w:type="dxa" w:w="120"/>
-              <w:bottom w:type="dxa" w:w="80"/>
-              <w:right w:type="dxa" w:w="120"/>
-            </w:tcMar>
-            <w:vAlign w:val="center"/>
-          </w:tcPr>
-          <w:p>
-            <w:pPr>
-              <w:spacing w:after="40" w:line="290"/>
-              <w:jc w:val="left"/>
-            </w:pPr>
-            <w:r>
-              <w:rPr>
-                <w:rFonts w:ascii="Yu Gothic" w:eastAsia="Yu Gothic" w:hAnsi="Yu Gothic"/>
-                <w:b/>
-                <w:bCs/>
-                <w:sz w:val="21"/>
-                <w:szCs w:val="21"/>
-              </w:rPr>
-              <w:t xml:space="preserve">44時間（特例措置対象事業場）</w:t>
-            </w:r>
-          </w:p>
-        </w:tc>
-        <w:tc>
-          <w:tcPr>
-            <w:tcW w:type="dxa" w:w="1750"/>
-            <w:tcBorders>
-              <w:top w:val="single" w:color="A6B4C5" w:sz="4"/>
-              <w:left w:val="single" w:color="A6B4C5" w:sz="4"/>
-              <w:bottom w:val="single" w:color="A6B4C5" w:sz="4"/>
-              <w:right w:val="single" w:color="A6B4C5" w:sz="4"/>
-            </w:tcBorders>
-            <w:tcMar>
-              <w:top w:type="dxa" w:w="80"/>
-              <w:left w:type="dxa" w:w="120"/>
-              <w:bottom w:type="dxa" w:w="80"/>
-              <w:right w:type="dxa" w:w="120"/>
-            </w:tcMar>
-            <w:vAlign w:val="center"/>
-          </w:tcPr>
-          <w:p>
-            <w:pPr>
-              <w:spacing w:after="40" w:line="290"/>
-              <w:jc w:val="center"/>
-            </w:pPr>
-            <w:r>
-              <w:rPr>
-                <w:rFonts w:ascii="Yu Gothic" w:eastAsia="Yu Gothic" w:hAnsi="Yu Gothic"/>
-                <w:b w:val="false"/>
-                <w:bCs w:val="false"/>
-                <w:sz w:val="21"/>
-                <w:szCs w:val="21"/>
-              </w:rPr>
-              <w:t xml:space="preserve">176.0</w:t>
-            </w:r>
-          </w:p>
-        </w:tc>
-        <w:tc>
-          <w:tcPr>
-            <w:tcW w:type="dxa" w:w="1750"/>
-            <w:tcBorders>
-              <w:top w:val="single" w:color="A6B4C5" w:sz="4"/>
-              <w:left w:val="single" w:color="A6B4C5" w:sz="4"/>
-              <w:bottom w:val="single" w:color="A6B4C5" w:sz="4"/>
-              <w:right w:val="single" w:color="A6B4C5" w:sz="4"/>
-            </w:tcBorders>
-            <w:tcMar>
-              <w:top w:type="dxa" w:w="80"/>
-              <w:left w:type="dxa" w:w="120"/>
-              <w:bottom w:type="dxa" w:w="80"/>
-              <w:right w:type="dxa" w:w="120"/>
-            </w:tcMar>
-            <w:vAlign w:val="center"/>
-          </w:tcPr>
-          <w:p>
-            <w:pPr>
-              <w:spacing w:after="40" w:line="290"/>
-              <w:jc w:val="center"/>
-            </w:pPr>
-            <w:r>
-              <w:rPr>
-                <w:rFonts w:ascii="Yu Gothic" w:eastAsia="Yu Gothic" w:hAnsi="Yu Gothic"/>
-                <w:b w:val="false"/>
-                <w:bCs w:val="false"/>
-                <w:sz w:val="21"/>
-                <w:szCs w:val="21"/>
-              </w:rPr>
-              <w:t xml:space="preserve">182.2</w:t>
-            </w:r>
-          </w:p>
-        </w:tc>
-        <w:tc>
-          <w:tcPr>
-            <w:tcW w:type="dxa" w:w="1750"/>
-            <w:tcBorders>
-              <w:top w:val="single" w:color="A6B4C5" w:sz="4"/>
-              <w:left w:val="single" w:color="A6B4C5" w:sz="4"/>
-              <w:bottom w:val="single" w:color="A6B4C5" w:sz="4"/>
-              <w:right w:val="single" w:color="A6B4C5" w:sz="4"/>
-            </w:tcBorders>
-            <w:tcMar>
-              <w:top w:type="dxa" w:w="80"/>
-              <w:left w:type="dxa" w:w="120"/>
-              <w:bottom w:type="dxa" w:w="80"/>
-              <w:right w:type="dxa" w:w="120"/>
-            </w:tcMar>
-            <w:vAlign w:val="center"/>
-          </w:tcPr>
-          <w:p>
-            <w:pPr>
-              <w:spacing w:after="40" w:line="290"/>
-              <w:jc w:val="center"/>
-            </w:pPr>
-            <w:r>
-              <w:rPr>
-                <w:rFonts w:ascii="Yu Gothic" w:eastAsia="Yu Gothic" w:hAnsi="Yu Gothic"/>
-                <w:b w:val="false"/>
-                <w:bCs w:val="false"/>
-                <w:sz w:val="21"/>
-                <w:szCs w:val="21"/>
-              </w:rPr>
-              <w:t xml:space="preserve">188.5</w:t>
-            </w:r>
-          </w:p>
-        </w:tc>
-        <w:tc>
-          <w:tcPr>
-            <w:tcW w:type="dxa" w:w="1750"/>
-            <w:tcBorders>
-              <w:top w:val="single" w:color="A6B4C5" w:sz="4"/>
-              <w:left w:val="single" w:color="A6B4C5" w:sz="4"/>
-              <w:bottom w:val="single" w:color="A6B4C5" w:sz="4"/>
-              <w:right w:val="single" w:color="A6B4C5" w:sz="4"/>
-            </w:tcBorders>
-            <w:tcMar>
-              <w:top w:type="dxa" w:w="80"/>
-              <w:left w:type="dxa" w:w="120"/>
-              <w:bottom w:type="dxa" w:w="80"/>
-              <w:right w:type="dxa" w:w="120"/>
-            </w:tcMar>
-            <w:vAlign w:val="center"/>
-          </w:tcPr>
-          <w:p>
-            <w:pPr>
-              <w:spacing w:after="40" w:line="290"/>
-              <w:jc w:val="center"/>
-            </w:pPr>
-            <w:r>
-              <w:rPr>
-                <w:rFonts w:ascii="Yu Gothic" w:eastAsia="Yu Gothic" w:hAnsi="Yu Gothic"/>
-                <w:b w:val="false"/>
-                <w:bCs w:val="false"/>
-                <w:sz w:val="21"/>
-                <w:szCs w:val="21"/>
-              </w:rPr>
-              <w:t xml:space="preserve">194.8</w:t>
-            </w:r>
-          </w:p>
-        </w:tc>
-      </w:tr>
     </w:tbl>
     <w:p>
       <w:pPr>
@@ -3171,7 +2931,7 @@
                 <w:sz w:val="21"/>
                 <w:szCs w:val="21"/>
               </w:rPr>
-              <w:t xml:space="preserve">シフト表や会社カレンダーなどで、対象期間すべての労働日ごとの労働時間をあらかじめ具体的に定めます。対象期間を平均して週の法定労働時間（40時間／44時間）を超えないよう設定します。</w:t>
+              <w:t xml:space="preserve">シフト表や会社カレンダーなどで、対象期間すべての労働日ごとの労働時間をあらかじめ具体的に定めます。対象期間を平均して週の法定労働時間（40時間）を超えないよう設定します。</w:t>
             </w:r>
           </w:p>
         </w:tc>
@@ -3409,7 +3169,7 @@
         <w:rPr>
           <w:rFonts w:ascii="Yu Gothic" w:eastAsia="Yu Gothic" w:hAnsi="Yu Gothic"/>
         </w:rPr>
-        <w:t xml:space="preserve">40時間（特例措置対象事業場は44時間）を超える時間を定めた週はその時間、それ以外の週は40時間（同44時間）を超えて労働した時間（１日で時間外労働となる時間を除く）</w:t>
+        <w:t xml:space="preserve">40時間を超える時間を定めた週はその時間、それ以外の週は40時間を超えて労働した時間（１日で時間外労働となる時間を除く）</w:t>
       </w:r>
     </w:p>
     <w:p>

</xml_diff>